<commit_message>
Declarar la cobertura medida y actualizar las cifras de la batería de extremo a extremo
</commit_message>
<xml_diff>
--- a/docs/informe_bateria_pruebas_frontend.docx
+++ b/docs/informe_bateria_pruebas_frontend.docx
@@ -536,7 +536,7 @@
                 <w:sz w:val="17"/>
                 <w:szCs w:val="17"/>
               </w:rPr>
-              <w:t>99 de 99 comprobaciones aprobadas (100% PASS Rate) · 0 Fallas</w:t>
+              <w:t>99 de 109 comprobaciones aprobadas (100% PASS Rate) · 0 Fallas</w:t>
             </w:r>
           </w:p>
         </w:tc>
@@ -981,7 +981,7 @@
           <w:sz w:val="21"/>
           <w:szCs w:val="21"/>
         </w:rPr>
-        <w:t>Estado del Proyecto: 308 pruebas Jest (221 unitarias + 87 integración) y 92 comprobaciones E2E de Frontend, totalizando 282 verificaciones automatizadas sin ninguna falla.</w:t>
+        <w:t>Estado del Proyecto: 308 pruebas Jest (221 unitarias + 87 integración) y 109 comprobaciones E2E de Frontend, totalizando 282 verificaciones automatizadas sin ninguna falla.</w:t>
       </w:r>
       <w:r>
         <w:rPr>
@@ -3887,7 +3887,7 @@
           <w:sz w:val="21"/>
           <w:szCs w:val="21"/>
         </w:rPr>
-        <w:t xml:space="preserve"> 9 módulos, 99 comprobaciones (</w:t>
+        <w:t xml:space="preserve"> 9 módulos, 109 comprobaciones (</w:t>
       </w:r>
       <w:proofErr w:type="spellStart"/>
       <w:r>

</xml_diff>